<commit_message>
docs(bc3): rédige la partie 8.2 (évolution de la posture professionnelle)
Remplace la zone à compléter de la partie 8.2 par un paragraphe rédigé à
partir d'exemples vécus (gestion des commentaires négatifs, prise de parole
en reporting, prises de décision et propositions autonomes). Met à jour la
check-list A_COMPLETER.md en conséquence.

Co-Authored-By: Claude Opus 4.8 <noreply@anthropic.com>
Claude-Session: https://claude.ai/code/session_013XZsCkVv1YrHfxt73dcWQ8
</commit_message>
<xml_diff>
--- a/dossier-bc3/Dossier_BC3_Estelle_CASTEROT.docx
+++ b/dossier-bc3/Dossier_BC3_Estelle_CASTEROT.docx
@@ -3828,12 +3828,11 @@
       </w:r>
     </w:p>
     <w:p>
+      <w:pPr>
+        <w:jc w:val="both"/>
+      </w:pPr>
       <w:r>
-        <w:rPr>
-          <w:i/>
-          <w:highlight w:val="yellow"/>
-        </w:rPr>
-        <w:t>[À compléter : personnalisez ce paragraphe avec un exemple précis qui montre votre évolution, par exemple une décision que vous n'auriez pas osé prendre au début et que vous avez prise ensuite seule]</w:t>
+        <w:t>Trois exemples concrets résument bien cette évolution. Au début, lorsqu'il fallait répondre à des commentaires négatifs sur les réseaux, je demandais systématiquement de l'aide, car l'exercice n'était pas simple et je craignais de mal formuler ma réponse. Avec le temps, j'ai appris à gérer ces messages seule, en gardant le bon ton et en protégeant l'image de la marque. Le reporting a été un autre cap. Prendre la parole pour présenter mes résultats m'intimidait et je l'appréhendais chaque semaine, mais à force de le pratiquer lors de nos points hebdomadaires, j'ai gagné en aisance, au point d'être aujourd'hui à l'aise pour exposer et défendre mon travail. Enfin, j'ai appris à décider seule quand la situation l'exigeait et à être force de proposition, notamment en suggérant des idées de posts et de contenus plutôt que d'attendre qu'on me les dicte. Ce sont ces petits pas, répétés semaine après semaine, qui m'ont fait passer d'une posture d'exécutante à une posture de cheffe de projet.</w:t>
       </w:r>
     </w:p>
     <w:p>

</xml_diff>